<commit_message>
feat: Alinha versões PT/EN como espelhos e gera DOCX finais
</commit_message>
<xml_diff>
--- a/2-MANUSCRITO/modelo_formatacao.docx
+++ b/2-MANUSCRITO/modelo_formatacao.docx
@@ -6,13 +6,17 @@
       <w:pPr>
         <w:pStyle w:val="Ttulo1"/>
         <w:rPr>
-          <w:szCs w:val="24"/>
+          <w:rFonts w:ascii="Times New Roman" w:hAnsi="Times New Roman" w:cs="Times New Roman"/>
+          <w:sz w:val="20"/>
+          <w:szCs w:val="20"/>
           <w:u w:val="single"/>
         </w:rPr>
       </w:pPr>
       <w:r>
         <w:rPr>
-          <w:szCs w:val="24"/>
+          <w:rFonts w:ascii="Times New Roman" w:hAnsi="Times New Roman" w:cs="Times New Roman"/>
+          <w:sz w:val="20"/>
+          <w:szCs w:val="20"/>
         </w:rPr>
         <w:t>Introdução</w:t>
       </w:r>
@@ -20,38 +24,91 @@
     <w:p>
       <w:pPr>
         <w:ind w:firstLine="0"/>
+        <w:rPr>
+          <w:rFonts w:ascii="Times New Roman" w:hAnsi="Times New Roman"/>
+          <w:sz w:val="20"/>
+          <w:szCs w:val="20"/>
+        </w:rPr>
       </w:pPr>
     </w:p>
     <w:p>
       <w:pPr>
         <w:ind w:firstLine="0"/>
+        <w:rPr>
+          <w:rFonts w:ascii="Times New Roman" w:hAnsi="Times New Roman"/>
+          <w:sz w:val="20"/>
+          <w:szCs w:val="20"/>
+        </w:rPr>
       </w:pPr>
     </w:p>
     <w:p>
       <w:pPr>
         <w:pStyle w:val="Ttulo2"/>
+        <w:rPr>
+          <w:rFonts w:ascii="Times New Roman" w:hAnsi="Times New Roman" w:cs="Times New Roman"/>
+          <w:sz w:val="20"/>
+          <w:szCs w:val="20"/>
+        </w:rPr>
       </w:pPr>
       <w:r>
+        <w:rPr>
+          <w:rFonts w:ascii="Times New Roman" w:hAnsi="Times New Roman" w:cs="Times New Roman"/>
+          <w:sz w:val="20"/>
+          <w:szCs w:val="20"/>
+        </w:rPr>
         <w:t>testes</w:t>
       </w:r>
     </w:p>
     <w:p>
       <w:pPr>
         <w:pStyle w:val="Ttulo2"/>
+        <w:rPr>
+          <w:rFonts w:ascii="Times New Roman" w:hAnsi="Times New Roman" w:cs="Times New Roman"/>
+          <w:sz w:val="20"/>
+          <w:szCs w:val="20"/>
+        </w:rPr>
       </w:pPr>
       <w:r>
+        <w:rPr>
+          <w:rFonts w:ascii="Times New Roman" w:hAnsi="Times New Roman" w:cs="Times New Roman"/>
+          <w:sz w:val="20"/>
+          <w:szCs w:val="20"/>
+        </w:rPr>
         <w:t>T</w:t>
       </w:r>
       <w:r>
+        <w:rPr>
+          <w:rFonts w:ascii="Times New Roman" w:hAnsi="Times New Roman" w:cs="Times New Roman"/>
+          <w:sz w:val="20"/>
+          <w:szCs w:val="20"/>
+        </w:rPr>
         <w:t>estes</w:t>
       </w:r>
     </w:p>
-    <w:p/>
     <w:p>
       <w:pPr>
+        <w:rPr>
+          <w:rFonts w:ascii="Times New Roman" w:hAnsi="Times New Roman"/>
+          <w:sz w:val="20"/>
+          <w:szCs w:val="20"/>
+        </w:rPr>
+      </w:pPr>
+    </w:p>
+    <w:p>
+      <w:pPr>
         <w:ind w:firstLine="0"/>
+        <w:rPr>
+          <w:rFonts w:ascii="Times New Roman" w:hAnsi="Times New Roman"/>
+          <w:sz w:val="20"/>
+          <w:szCs w:val="20"/>
+        </w:rPr>
       </w:pPr>
       <w:r>
+        <w:rPr>
+          <w:rFonts w:ascii="Times New Roman" w:hAnsi="Times New Roman"/>
+          <w:sz w:val="20"/>
+          <w:szCs w:val="20"/>
+        </w:rPr>
         <w:t>Testando estilo corpo do texto</w:t>
       </w:r>
     </w:p>
@@ -81,6 +138,7 @@
           <w:p>
             <w:pPr>
               <w:rPr>
+                <w:rFonts w:ascii="Times New Roman" w:hAnsi="Times New Roman"/>
                 <w:b/>
                 <w:bCs/>
               </w:rPr>
@@ -98,6 +156,7 @@
           <w:p>
             <w:pPr>
               <w:rPr>
+                <w:rFonts w:ascii="Times New Roman" w:hAnsi="Times New Roman"/>
                 <w:b/>
                 <w:bCs/>
               </w:rPr>
@@ -116,7 +175,13 @@
               <w:top w:val="single" w:sz="4" w:space="0" w:color="auto"/>
             </w:tcBorders>
           </w:tcPr>
-          <w:p/>
+          <w:p>
+            <w:pPr>
+              <w:rPr>
+                <w:rFonts w:ascii="Times New Roman" w:hAnsi="Times New Roman"/>
+              </w:rPr>
+            </w:pPr>
+          </w:p>
         </w:tc>
         <w:tc>
           <w:tcPr>
@@ -125,7 +190,13 @@
               <w:top w:val="single" w:sz="4" w:space="0" w:color="auto"/>
             </w:tcBorders>
           </w:tcPr>
-          <w:p/>
+          <w:p>
+            <w:pPr>
+              <w:rPr>
+                <w:rFonts w:ascii="Times New Roman" w:hAnsi="Times New Roman"/>
+              </w:rPr>
+            </w:pPr>
+          </w:p>
         </w:tc>
       </w:tr>
       <w:tr>
@@ -139,7 +210,13 @@
               <w:bottom w:val="single" w:sz="4" w:space="0" w:color="auto"/>
             </w:tcBorders>
           </w:tcPr>
-          <w:p/>
+          <w:p>
+            <w:pPr>
+              <w:rPr>
+                <w:rFonts w:ascii="Times New Roman" w:hAnsi="Times New Roman"/>
+              </w:rPr>
+            </w:pPr>
+          </w:p>
         </w:tc>
         <w:tc>
           <w:tcPr>
@@ -148,27 +225,53 @@
               <w:bottom w:val="single" w:sz="4" w:space="0" w:color="auto"/>
             </w:tcBorders>
           </w:tcPr>
-          <w:p/>
+          <w:p>
+            <w:pPr>
+              <w:rPr>
+                <w:rFonts w:ascii="Times New Roman" w:hAnsi="Times New Roman"/>
+              </w:rPr>
+            </w:pPr>
+          </w:p>
         </w:tc>
       </w:tr>
     </w:tbl>
     <w:p>
       <w:pPr>
         <w:ind w:firstLine="0"/>
+        <w:rPr>
+          <w:rFonts w:ascii="Times New Roman" w:hAnsi="Times New Roman"/>
+          <w:sz w:val="20"/>
+          <w:szCs w:val="20"/>
+        </w:rPr>
       </w:pPr>
     </w:p>
     <w:p>
       <w:pPr>
         <w:pStyle w:val="Image"/>
+        <w:rPr>
+          <w:rFonts w:ascii="Times New Roman" w:hAnsi="Times New Roman"/>
+          <w:sz w:val="20"/>
+          <w:szCs w:val="20"/>
+        </w:rPr>
       </w:pPr>
     </w:p>
     <w:p>
       <w:pPr>
         <w:pStyle w:val="Image"/>
+        <w:rPr>
+          <w:rFonts w:ascii="Times New Roman" w:hAnsi="Times New Roman"/>
+          <w:sz w:val="20"/>
+          <w:szCs w:val="20"/>
+        </w:rPr>
       </w:pPr>
       <w:r>
+        <w:rPr>
+          <w:rFonts w:ascii="Times New Roman" w:hAnsi="Times New Roman"/>
+          <w:sz w:val="20"/>
+          <w:szCs w:val="20"/>
+        </w:rPr>
         <w:drawing>
-          <wp:inline distT="0" distB="0" distL="0" distR="0" wp14:anchorId="0FEC3393" wp14:editId="2DEFB0D5">
+          <wp:inline distT="0" distB="0" distL="0" distR="0" wp14:anchorId="0FEC3393" wp14:editId="5C885EA4">
             <wp:extent cx="2519360" cy="2519360"/>
             <wp:effectExtent l="0" t="0" r="0" b="0"/>
             <wp:docPr id="1230334629" name="Imagem 1" descr="Gráfico&#10;&#10;O conteúdo gerado por IA pode estar incorreto."/>
@@ -3488,9 +3591,6 @@
     <w:name w:val="Normal"/>
     <w:qFormat/>
     <w:rsid w:val="008457F2"/>
-    <w:pPr>
-      <w:spacing w:after="0"/>
-    </w:pPr>
   </w:style>
   <w:style w:type="paragraph" w:styleId="Ttulo1">
     <w:name w:val="heading 1"/>
@@ -3809,9 +3909,6 @@
     <w:name w:val="Body Text"/>
     <w:basedOn w:val="Normal"/>
     <w:rsid w:val="00074070"/>
-    <w:pPr>
-      <w:spacing w:after="120"/>
-    </w:pPr>
   </w:style>
   <w:style w:type="paragraph" w:styleId="Lista">
     <w:name w:val="List"/>
@@ -4915,14 +5012,14 @@
         <a:srgbClr val="954F72"/>
       </a:folHlink>
     </a:clrScheme>
-    <a:fontScheme name="Personalizada 3">
+    <a:fontScheme name="Personalizada 6">
       <a:majorFont>
-        <a:latin typeface="Aptos"/>
+        <a:latin typeface="Times New Roman"/>
         <a:ea typeface=""/>
         <a:cs typeface=""/>
       </a:majorFont>
       <a:minorFont>
-        <a:latin typeface="Aptos"/>
+        <a:latin typeface="Times New Roman"/>
         <a:ea typeface=""/>
         <a:cs typeface=""/>
       </a:minorFont>

</xml_diff>